<commit_message>
fix: rebuild examples — remove hanging indent from bibliography
- rebuild_examples.py: strip leading "N. " from extracted sources
  before passing to add_sources (которая добавляет номер сама),
  иначе получалось "1. 1. Источник..."
- Все три example DOCX пересобраны: w:left=0 w:firstLine=0
  вместо w:left=709 w:hanging=709 → висячий отступ в docx-preview исчез

Co-Authored-By: Claude Sonnet 4.6 <noreply@anthropic.com>
</commit_message>
<xml_diff>
--- a/frontend/public/examples/doklad.docx
+++ b/frontend/public/examples/doklad.docx
@@ -1632,9 +1632,9 @@
     </w:p>
     <w:p>
       <w:pPr>
+        <w:spacing w:line="420" w:lineRule="exact" w:before="0" w:after="120"/>
+        <w:ind w:firstLine="0" w:left="0"/>
         <w:jc w:val="both"/>
-        <w:spacing w:line="420" w:lineRule="exact" w:before="0" w:after="80"/>
-        <w:ind w:left="709" w:hanging="709"/>
       </w:pPr>
       <w:r>
         <w:rPr>
@@ -1648,9 +1648,9 @@
     </w:p>
     <w:p>
       <w:pPr>
+        <w:spacing w:line="420" w:lineRule="exact" w:before="0" w:after="120"/>
+        <w:ind w:firstLine="0" w:left="0"/>
         <w:jc w:val="both"/>
-        <w:spacing w:line="420" w:lineRule="exact" w:before="0" w:after="80"/>
-        <w:ind w:left="709" w:hanging="709"/>
       </w:pPr>
       <w:r>
         <w:rPr>
@@ -1664,9 +1664,9 @@
     </w:p>
     <w:p>
       <w:pPr>
+        <w:spacing w:line="420" w:lineRule="exact" w:before="0" w:after="120"/>
+        <w:ind w:firstLine="0" w:left="0"/>
         <w:jc w:val="both"/>
-        <w:spacing w:line="420" w:lineRule="exact" w:before="0" w:after="80"/>
-        <w:ind w:left="709" w:hanging="709"/>
       </w:pPr>
       <w:r>
         <w:rPr>
@@ -1680,9 +1680,9 @@
     </w:p>
     <w:p>
       <w:pPr>
+        <w:spacing w:line="420" w:lineRule="exact" w:before="0" w:after="120"/>
+        <w:ind w:firstLine="0" w:left="0"/>
         <w:jc w:val="both"/>
-        <w:spacing w:line="420" w:lineRule="exact" w:before="0" w:after="80"/>
-        <w:ind w:left="709" w:hanging="709"/>
       </w:pPr>
       <w:r>
         <w:rPr>
@@ -1696,9 +1696,9 @@
     </w:p>
     <w:p>
       <w:pPr>
+        <w:spacing w:line="420" w:lineRule="exact" w:before="0" w:after="120"/>
+        <w:ind w:firstLine="0" w:left="0"/>
         <w:jc w:val="both"/>
-        <w:spacing w:line="420" w:lineRule="exact" w:before="0" w:after="80"/>
-        <w:ind w:left="709" w:hanging="709"/>
       </w:pPr>
       <w:r>
         <w:rPr>
@@ -1712,9 +1712,9 @@
     </w:p>
     <w:p>
       <w:pPr>
+        <w:spacing w:line="420" w:lineRule="exact" w:before="0" w:after="120"/>
+        <w:ind w:firstLine="0" w:left="0"/>
         <w:jc w:val="both"/>
-        <w:spacing w:line="420" w:lineRule="exact" w:before="0" w:after="80"/>
-        <w:ind w:left="709" w:hanging="709"/>
       </w:pPr>
       <w:r>
         <w:rPr>
@@ -1728,9 +1728,9 @@
     </w:p>
     <w:p>
       <w:pPr>
+        <w:spacing w:line="420" w:lineRule="exact" w:before="0" w:after="120"/>
+        <w:ind w:firstLine="0" w:left="0"/>
         <w:jc w:val="both"/>
-        <w:spacing w:line="420" w:lineRule="exact" w:before="0" w:after="80"/>
-        <w:ind w:left="709" w:hanging="709"/>
       </w:pPr>
       <w:r>
         <w:rPr>
@@ -1744,9 +1744,9 @@
     </w:p>
     <w:p>
       <w:pPr>
+        <w:spacing w:line="420" w:lineRule="exact" w:before="0" w:after="120"/>
+        <w:ind w:firstLine="0" w:left="0"/>
         <w:jc w:val="both"/>
-        <w:spacing w:line="420" w:lineRule="exact" w:before="0" w:after="80"/>
-        <w:ind w:left="709" w:hanging="709"/>
       </w:pPr>
       <w:r>
         <w:rPr>

</xml_diff>